<commit_message>
Add MCP server, fix source URLs, apply verification corrections
- MCP server exposing build, verify, query and scoring tools, with .mcp.json
- All 34 source URLs now resolve; 11 were dead and have been corrected
- BCBS instruments requalified as Guidelines, not Standards
- OSFI 2017 supersession language softened to what is verifiable
- Three further red-team entries recorded (21 total)

Co-Authored-By: Claude Opus 5 <noreply@anthropic.com>
Claude-Session: https://claude.ai/code/session_01U9tVmgcRH2aPufRoj4ddoe
</commit_message>
<xml_diff>
--- a/CPG_240_Model_Risk_Management.docx
+++ b/CPG_240_Model_Risk_Management.docx
@@ -12415,7 +12415,7 @@
         <w:pStyle w:val="SourceNote"/>
       </w:pPr>
       <w:r>
-        <w:t>Structured as three outcomes, each heading a group of principles numbered X.Y where X is the parent outcome. Twelve principles in total. A mapping that treats E-23 as having only three citable units under-represents it by twelve.</w:t>
+        <w:t>Structured as three outcomes, each heading a group of principles numbered X.Y where X is the parent outcome. Twelve principles in total. A mapping that treats E-23 as having only three citable units under-represents it by twelve. The guideline also carries Appendix 1, Information tracking for models, which sets out minimum inventory content and informed Annex B of CPS 240.</w:t>
       </w:r>
     </w:p>
     <w:tbl>
@@ -18613,7 +18613,7 @@
                 <w:rFonts w:ascii="Arial" w:hAnsi="Arial"/>
                 <w:sz w:val="14"/>
               </w:rPr>
-              <w:t>Supervisory guideline, superseded by the 2027 guideline with effect from 1 May 2027.</w:t>
+              <w:t>Supervisory guideline. OSFI's guidance library presents the 2027 guideline as its replacement from 1 May 2027, but no express supersession clause was located in either the 2027 guideline or its covering letter, so the relationship is stated as OSFI presents it rather than as a quoted provision.</w:t>
             </w:r>
           </w:p>
         </w:tc>
@@ -19417,7 +19417,7 @@
                 <w:rFonts w:ascii="Arial" w:hAnsi="Arial"/>
                 <w:sz w:val="14"/>
               </w:rPr>
-              <w:t>International principles. Effect depends on domestic implementation.</w:t>
+              <w:t>BIS-classified Guidelines. The document expressly states that the principles do not constitute Standards, for which the Basel Committee expects full implementation. Domestic effect depends on implementation by national authorities.</w:t>
             </w:r>
           </w:p>
         </w:tc>
@@ -19775,7 +19775,7 @@
                 <w:rFonts w:ascii="Arial" w:hAnsi="Arial"/>
                 <w:sz w:val="14"/>
               </w:rPr>
-              <w:t>International principles. Effect depends on domestic implementation.</w:t>
+              <w:t>BIS-classified Guidelines, not a Standard. Domestic effect depends on implementation by national authorities.</w:t>
             </w:r>
           </w:p>
         </w:tc>

</xml_diff>

<commit_message>
Correct CPS 230 commencement and add paragraph-level APRA anchors
CPS 230's current determination (23 Apr 2026) commences 1 Jul 2026,
replacing the 2023 determination. The APRA principles entry now carries
22 paragraph-level references read from the primary instruments,
evidencing the package's central premise that Australian model
governance obligations are distributed rather than consolidated.

Co-Authored-By: Claude Opus 5 <noreply@anthropic.com>
Claude-Session: https://claude.ai/code/session_01U9tVmgcRH2aPufRoj4ddoe
</commit_message>
<xml_diff>
--- a/CPG_240_Model_Risk_Management.docx
+++ b/CPG_240_Model_Risk_Management.docx
@@ -17214,7 +17214,7 @@
         <w:pStyle w:val="SourceNote"/>
       </w:pPr>
       <w:r>
-        <w:t>APRA has no enumerated model risk principles. Model governance obligations sit inside instruments written for other purposes, which is the gap CPS 240 addresses.</w:t>
+        <w:t>APRA has no model risk prudential standard and no enumerated model risk principles. Model governance obligations are distributed across instruments written for other purposes, and cannot be mapped one-to-one against a comparator principle set. That distribution is the gap CPS 240 addresses. Paragraph references below were read from the primary instruments.</w:t>
       </w:r>
     </w:p>
     <w:tbl>
@@ -17301,7 +17301,7 @@
                 <w:rFonts w:ascii="Arial" w:hAnsi="Arial"/>
                 <w:sz w:val="16"/>
               </w:rPr>
-              <w:t>APS 113</w:t>
+              <w:t>APS 113 paras 15–19</w:t>
             </w:r>
           </w:p>
         </w:tc>
@@ -17318,7 +17318,7 @@
                 <w:rFonts w:ascii="Arial" w:hAnsi="Arial"/>
                 <w:sz w:val="16"/>
               </w:rPr>
-              <w:t>Internal ratings-based approach — model approval, independent review, validation and the use test</w:t>
+              <w:t>Key principles</w:t>
             </w:r>
           </w:p>
         </w:tc>
@@ -17338,7 +17338,7 @@
                 <w:rFonts w:ascii="Arial" w:hAnsi="Arial"/>
                 <w:sz w:val="16"/>
               </w:rPr>
-              <w:t>CPS 220 / SPS 220</w:t>
+              <w:t>APS 113 paras 20–23</w:t>
             </w:r>
           </w:p>
         </w:tc>
@@ -17356,7 +17356,7 @@
                 <w:rFonts w:ascii="Arial" w:hAnsi="Arial"/>
                 <w:sz w:val="16"/>
               </w:rPr>
-              <w:t>Risk management framework and risk appetite; model risk not named</w:t>
+              <w:t>Governance and oversight</w:t>
             </w:r>
           </w:p>
         </w:tc>
@@ -17375,7 +17375,7 @@
                 <w:rFonts w:ascii="Arial" w:hAnsi="Arial"/>
                 <w:sz w:val="16"/>
               </w:rPr>
-              <w:t>CPS 230</w:t>
+              <w:t>APS 113 para 27</w:t>
             </w:r>
           </w:p>
         </w:tc>
@@ -17392,7 +17392,7 @@
                 <w:rFonts w:ascii="Arial" w:hAnsi="Arial"/>
                 <w:sz w:val="16"/>
               </w:rPr>
-              <w:t>Operational risk, critical operations, tolerance levels and service providers</w:t>
+              <w:t>Independent review</w:t>
             </w:r>
           </w:p>
         </w:tc>
@@ -17412,7 +17412,7 @@
                 <w:rFonts w:ascii="Arial" w:hAnsi="Arial"/>
                 <w:sz w:val="16"/>
               </w:rPr>
-              <w:t>CPS 234</w:t>
+              <w:t>APS 113 paras 42–56</w:t>
             </w:r>
           </w:p>
         </w:tc>
@@ -17430,7 +17430,7 @@
                 <w:rFonts w:ascii="Arial" w:hAnsi="Arial"/>
                 <w:sz w:val="16"/>
               </w:rPr>
-              <w:t>Information security controls and incident notification</w:t>
+              <w:t>IRB approval, initial approval, phased roll-out, permanent partial use and ongoing requirements</w:t>
             </w:r>
           </w:p>
         </w:tc>
@@ -17449,7 +17449,7 @@
                 <w:rFonts w:ascii="Arial" w:hAnsi="Arial"/>
                 <w:sz w:val="16"/>
               </w:rPr>
-              <w:t>CPG 235</w:t>
+              <w:t>APS 113 Att. D paras 29–35</w:t>
             </w:r>
           </w:p>
         </w:tc>
@@ -17466,7 +17466,7 @@
                 <w:rFonts w:ascii="Arial" w:hAnsi="Arial"/>
                 <w:sz w:val="16"/>
               </w:rPr>
-              <w:t>Managing data risk — practice guide, non-enforceable</w:t>
+              <w:t>Use of statistical models in the rating process</w:t>
             </w:r>
           </w:p>
         </w:tc>
@@ -17486,7 +17486,7 @@
                 <w:rFonts w:ascii="Arial" w:hAnsi="Arial"/>
                 <w:sz w:val="16"/>
               </w:rPr>
-              <w:t>CPS 320</w:t>
+              <w:t>APS 113 Att. D paras 67–68</w:t>
             </w:r>
           </w:p>
         </w:tc>
@@ -17504,7 +17504,7 @@
                 <w:rFonts w:ascii="Arial" w:hAnsi="Arial"/>
                 <w:sz w:val="16"/>
               </w:rPr>
-              <w:t>Actuarial and related matters, including the Appointed Actuary</w:t>
+              <w:t>Use of internal ratings (the use test)</w:t>
             </w:r>
           </w:p>
         </w:tc>
@@ -17523,7 +17523,7 @@
                 <w:rFonts w:ascii="Arial" w:hAnsi="Arial"/>
                 <w:sz w:val="16"/>
               </w:rPr>
-              <w:t>SPS 530</w:t>
+              <w:t>APS 113 Att. D paras 103–109</w:t>
             </w:r>
           </w:p>
         </w:tc>
@@ -17540,7 +17540,525 @@
                 <w:rFonts w:ascii="Arial" w:hAnsi="Arial"/>
                 <w:sz w:val="16"/>
               </w:rPr>
-              <w:t>Investment governance, valuation, liquidity and stress testing</w:t>
+              <w:t>Validation of internal estimates</w:t>
+            </w:r>
+          </w:p>
+        </w:tc>
+      </w:tr>
+      <w:tr>
+        <w:tc>
+          <w:tcPr>
+            <w:tcW w:type="dxa" w:w="1928"/>
+            <w:shd w:val="clear" w:color="auto" w:fill="F4F6FA"/>
+          </w:tcPr>
+          <w:p>
+            <w:pPr>
+              <w:pStyle w:val="TableText"/>
+            </w:pPr>
+            <w:r>
+              <w:rPr>
+                <w:rFonts w:ascii="Arial" w:hAnsi="Arial"/>
+                <w:sz w:val="16"/>
+              </w:rPr>
+              <w:t>APG 113 Chapter 7</w:t>
+            </w:r>
+          </w:p>
+        </w:tc>
+        <w:tc>
+          <w:tcPr>
+            <w:tcW w:type="dxa" w:w="7483"/>
+            <w:shd w:val="clear" w:color="auto" w:fill="F4F6FA"/>
+          </w:tcPr>
+          <w:p>
+            <w:pPr>
+              <w:pStyle w:val="TableText"/>
+            </w:pPr>
+            <w:r>
+              <w:rPr>
+                <w:rFonts w:ascii="Arial" w:hAnsi="Arial"/>
+                <w:sz w:val="16"/>
+              </w:rPr>
+              <w:t>Validation of rating systems and risk estimates</w:t>
+            </w:r>
+          </w:p>
+        </w:tc>
+      </w:tr>
+      <w:tr>
+        <w:tc>
+          <w:tcPr>
+            <w:tcW w:type="dxa" w:w="1928"/>
+          </w:tcPr>
+          <w:p>
+            <w:pPr>
+              <w:pStyle w:val="TableText"/>
+            </w:pPr>
+            <w:r>
+              <w:rPr>
+                <w:rFonts w:ascii="Arial" w:hAnsi="Arial"/>
+                <w:sz w:val="16"/>
+              </w:rPr>
+              <w:t>CPS 220 paras 19–26</w:t>
+            </w:r>
+          </w:p>
+        </w:tc>
+        <w:tc>
+          <w:tcPr>
+            <w:tcW w:type="dxa" w:w="7483"/>
+          </w:tcPr>
+          <w:p>
+            <w:pPr>
+              <w:pStyle w:val="TableText"/>
+            </w:pPr>
+            <w:r>
+              <w:rPr>
+                <w:rFonts w:ascii="Arial" w:hAnsi="Arial"/>
+                <w:sz w:val="16"/>
+              </w:rPr>
+              <w:t>Risk management framework</w:t>
+            </w:r>
+          </w:p>
+        </w:tc>
+      </w:tr>
+      <w:tr>
+        <w:tc>
+          <w:tcPr>
+            <w:tcW w:type="dxa" w:w="1928"/>
+            <w:shd w:val="clear" w:color="auto" w:fill="F4F6FA"/>
+          </w:tcPr>
+          <w:p>
+            <w:pPr>
+              <w:pStyle w:val="TableText"/>
+            </w:pPr>
+            <w:r>
+              <w:rPr>
+                <w:rFonts w:ascii="Arial" w:hAnsi="Arial"/>
+                <w:sz w:val="16"/>
+              </w:rPr>
+              <w:t>CPS 220 paras 27–28</w:t>
+            </w:r>
+          </w:p>
+        </w:tc>
+        <w:tc>
+          <w:tcPr>
+            <w:tcW w:type="dxa" w:w="7483"/>
+            <w:shd w:val="clear" w:color="auto" w:fill="F4F6FA"/>
+          </w:tcPr>
+          <w:p>
+            <w:pPr>
+              <w:pStyle w:val="TableText"/>
+            </w:pPr>
+            <w:r>
+              <w:rPr>
+                <w:rFonts w:ascii="Arial" w:hAnsi="Arial"/>
+                <w:sz w:val="16"/>
+              </w:rPr>
+              <w:t>Risk appetite</w:t>
+            </w:r>
+          </w:p>
+        </w:tc>
+      </w:tr>
+      <w:tr>
+        <w:tc>
+          <w:tcPr>
+            <w:tcW w:type="dxa" w:w="1928"/>
+          </w:tcPr>
+          <w:p>
+            <w:pPr>
+              <w:pStyle w:val="TableText"/>
+            </w:pPr>
+            <w:r>
+              <w:rPr>
+                <w:rFonts w:ascii="Arial" w:hAnsi="Arial"/>
+                <w:sz w:val="16"/>
+              </w:rPr>
+              <w:t>CPS 220 paras 44–51</w:t>
+            </w:r>
+          </w:p>
+        </w:tc>
+        <w:tc>
+          <w:tcPr>
+            <w:tcW w:type="dxa" w:w="7483"/>
+          </w:tcPr>
+          <w:p>
+            <w:pPr>
+              <w:pStyle w:val="TableText"/>
+            </w:pPr>
+            <w:r>
+              <w:rPr>
+                <w:rFonts w:ascii="Arial" w:hAnsi="Arial"/>
+                <w:sz w:val="16"/>
+              </w:rPr>
+              <w:t>Review of the risk management framework</w:t>
+            </w:r>
+          </w:p>
+        </w:tc>
+      </w:tr>
+      <w:tr>
+        <w:tc>
+          <w:tcPr>
+            <w:tcW w:type="dxa" w:w="1928"/>
+            <w:shd w:val="clear" w:color="auto" w:fill="F4F6FA"/>
+          </w:tcPr>
+          <w:p>
+            <w:pPr>
+              <w:pStyle w:val="TableText"/>
+            </w:pPr>
+            <w:r>
+              <w:rPr>
+                <w:rFonts w:ascii="Arial" w:hAnsi="Arial"/>
+                <w:sz w:val="16"/>
+              </w:rPr>
+              <w:t>CPS 230 paras 11–14</w:t>
+            </w:r>
+          </w:p>
+        </w:tc>
+        <w:tc>
+          <w:tcPr>
+            <w:tcW w:type="dxa" w:w="7483"/>
+            <w:shd w:val="clear" w:color="auto" w:fill="F4F6FA"/>
+          </w:tcPr>
+          <w:p>
+            <w:pPr>
+              <w:pStyle w:val="TableText"/>
+            </w:pPr>
+            <w:r>
+              <w:rPr>
+                <w:rFonts w:ascii="Arial" w:hAnsi="Arial"/>
+                <w:sz w:val="16"/>
+              </w:rPr>
+              <w:t>Key principles</w:t>
+            </w:r>
+          </w:p>
+        </w:tc>
+      </w:tr>
+      <w:tr>
+        <w:tc>
+          <w:tcPr>
+            <w:tcW w:type="dxa" w:w="1928"/>
+          </w:tcPr>
+          <w:p>
+            <w:pPr>
+              <w:pStyle w:val="TableText"/>
+            </w:pPr>
+            <w:r>
+              <w:rPr>
+                <w:rFonts w:ascii="Arial" w:hAnsi="Arial"/>
+                <w:sz w:val="16"/>
+              </w:rPr>
+              <w:t>CPS 230 paras 28–30</w:t>
+            </w:r>
+          </w:p>
+        </w:tc>
+        <w:tc>
+          <w:tcPr>
+            <w:tcW w:type="dxa" w:w="7483"/>
+          </w:tcPr>
+          <w:p>
+            <w:pPr>
+              <w:pStyle w:val="TableText"/>
+            </w:pPr>
+            <w:r>
+              <w:rPr>
+                <w:rFonts w:ascii="Arial" w:hAnsi="Arial"/>
+                <w:sz w:val="16"/>
+              </w:rPr>
+              <w:t>Operational risk controls</w:t>
+            </w:r>
+          </w:p>
+        </w:tc>
+      </w:tr>
+      <w:tr>
+        <w:tc>
+          <w:tcPr>
+            <w:tcW w:type="dxa" w:w="1928"/>
+            <w:shd w:val="clear" w:color="auto" w:fill="F4F6FA"/>
+          </w:tcPr>
+          <w:p>
+            <w:pPr>
+              <w:pStyle w:val="TableText"/>
+            </w:pPr>
+            <w:r>
+              <w:rPr>
+                <w:rFonts w:ascii="Arial" w:hAnsi="Arial"/>
+                <w:sz w:val="16"/>
+              </w:rPr>
+              <w:t>CPS 230 paras 34–38</w:t>
+            </w:r>
+          </w:p>
+        </w:tc>
+        <w:tc>
+          <w:tcPr>
+            <w:tcW w:type="dxa" w:w="7483"/>
+            <w:shd w:val="clear" w:color="auto" w:fill="F4F6FA"/>
+          </w:tcPr>
+          <w:p>
+            <w:pPr>
+              <w:pStyle w:val="TableText"/>
+            </w:pPr>
+            <w:r>
+              <w:rPr>
+                <w:rFonts w:ascii="Arial" w:hAnsi="Arial"/>
+                <w:sz w:val="16"/>
+              </w:rPr>
+              <w:t>Critical operations and tolerance levels</w:t>
+            </w:r>
+          </w:p>
+        </w:tc>
+      </w:tr>
+      <w:tr>
+        <w:tc>
+          <w:tcPr>
+            <w:tcW w:type="dxa" w:w="1928"/>
+          </w:tcPr>
+          <w:p>
+            <w:pPr>
+              <w:pStyle w:val="TableText"/>
+            </w:pPr>
+            <w:r>
+              <w:rPr>
+                <w:rFonts w:ascii="Arial" w:hAnsi="Arial"/>
+                <w:sz w:val="16"/>
+              </w:rPr>
+              <w:t>CPS 234</w:t>
+            </w:r>
+          </w:p>
+        </w:tc>
+        <w:tc>
+          <w:tcPr>
+            <w:tcW w:type="dxa" w:w="7483"/>
+          </w:tcPr>
+          <w:p>
+            <w:pPr>
+              <w:pStyle w:val="TableText"/>
+            </w:pPr>
+            <w:r>
+              <w:rPr>
+                <w:rFonts w:ascii="Arial" w:hAnsi="Arial"/>
+                <w:sz w:val="16"/>
+              </w:rPr>
+              <w:t>Information security controls, testing and incident notification</w:t>
+            </w:r>
+          </w:p>
+        </w:tc>
+      </w:tr>
+      <w:tr>
+        <w:tc>
+          <w:tcPr>
+            <w:tcW w:type="dxa" w:w="1928"/>
+            <w:shd w:val="clear" w:color="auto" w:fill="F4F6FA"/>
+          </w:tcPr>
+          <w:p>
+            <w:pPr>
+              <w:pStyle w:val="TableText"/>
+            </w:pPr>
+            <w:r>
+              <w:rPr>
+                <w:rFonts w:ascii="Arial" w:hAnsi="Arial"/>
+                <w:sz w:val="16"/>
+              </w:rPr>
+              <w:t>CPG 235</w:t>
+            </w:r>
+          </w:p>
+        </w:tc>
+        <w:tc>
+          <w:tcPr>
+            <w:tcW w:type="dxa" w:w="7483"/>
+            <w:shd w:val="clear" w:color="auto" w:fill="F4F6FA"/>
+          </w:tcPr>
+          <w:p>
+            <w:pPr>
+              <w:pStyle w:val="TableText"/>
+            </w:pPr>
+            <w:r>
+              <w:rPr>
+                <w:rFonts w:ascii="Arial" w:hAnsi="Arial"/>
+                <w:sz w:val="16"/>
+              </w:rPr>
+              <w:t>Managing data risk — practice guide, non-enforceable</w:t>
+            </w:r>
+          </w:p>
+        </w:tc>
+      </w:tr>
+      <w:tr>
+        <w:tc>
+          <w:tcPr>
+            <w:tcW w:type="dxa" w:w="1928"/>
+          </w:tcPr>
+          <w:p>
+            <w:pPr>
+              <w:pStyle w:val="TableText"/>
+            </w:pPr>
+            <w:r>
+              <w:rPr>
+                <w:rFonts w:ascii="Arial" w:hAnsi="Arial"/>
+                <w:sz w:val="16"/>
+              </w:rPr>
+              <w:t>CPS 320 paras 22–23</w:t>
+            </w:r>
+          </w:p>
+        </w:tc>
+        <w:tc>
+          <w:tcPr>
+            <w:tcW w:type="dxa" w:w="7483"/>
+          </w:tcPr>
+          <w:p>
+            <w:pPr>
+              <w:pStyle w:val="TableText"/>
+            </w:pPr>
+            <w:r>
+              <w:rPr>
+                <w:rFonts w:ascii="Arial" w:hAnsi="Arial"/>
+                <w:sz w:val="16"/>
+              </w:rPr>
+              <w:t>Actuarial advice framework</w:t>
+            </w:r>
+          </w:p>
+        </w:tc>
+      </w:tr>
+      <w:tr>
+        <w:tc>
+          <w:tcPr>
+            <w:tcW w:type="dxa" w:w="1928"/>
+            <w:shd w:val="clear" w:color="auto" w:fill="F4F6FA"/>
+          </w:tcPr>
+          <w:p>
+            <w:pPr>
+              <w:pStyle w:val="TableText"/>
+            </w:pPr>
+            <w:r>
+              <w:rPr>
+                <w:rFonts w:ascii="Arial" w:hAnsi="Arial"/>
+                <w:sz w:val="16"/>
+              </w:rPr>
+              <w:t>CPS 320 paras 24–33</w:t>
+            </w:r>
+          </w:p>
+        </w:tc>
+        <w:tc>
+          <w:tcPr>
+            <w:tcW w:type="dxa" w:w="7483"/>
+            <w:shd w:val="clear" w:color="auto" w:fill="F4F6FA"/>
+          </w:tcPr>
+          <w:p>
+            <w:pPr>
+              <w:pStyle w:val="TableText"/>
+            </w:pPr>
+            <w:r>
+              <w:rPr>
+                <w:rFonts w:ascii="Arial" w:hAnsi="Arial"/>
+                <w:sz w:val="16"/>
+              </w:rPr>
+              <w:t>Financial Condition Report and Actuarial Valuation Report</w:t>
+            </w:r>
+          </w:p>
+        </w:tc>
+      </w:tr>
+      <w:tr>
+        <w:tc>
+          <w:tcPr>
+            <w:tcW w:type="dxa" w:w="1928"/>
+          </w:tcPr>
+          <w:p>
+            <w:pPr>
+              <w:pStyle w:val="TableText"/>
+            </w:pPr>
+            <w:r>
+              <w:rPr>
+                <w:rFonts w:ascii="Arial" w:hAnsi="Arial"/>
+                <w:sz w:val="16"/>
+              </w:rPr>
+              <w:t>CPS 320 paras 35–40</w:t>
+            </w:r>
+          </w:p>
+        </w:tc>
+        <w:tc>
+          <w:tcPr>
+            <w:tcW w:type="dxa" w:w="7483"/>
+          </w:tcPr>
+          <w:p>
+            <w:pPr>
+              <w:pStyle w:val="TableText"/>
+            </w:pPr>
+            <w:r>
+              <w:rPr>
+                <w:rFonts w:ascii="Arial" w:hAnsi="Arial"/>
+                <w:sz w:val="16"/>
+              </w:rPr>
+              <w:t>Actuarial reviews required by APRA</w:t>
+            </w:r>
+          </w:p>
+        </w:tc>
+      </w:tr>
+      <w:tr>
+        <w:tc>
+          <w:tcPr>
+            <w:tcW w:type="dxa" w:w="1928"/>
+            <w:shd w:val="clear" w:color="auto" w:fill="F4F6FA"/>
+          </w:tcPr>
+          <w:p>
+            <w:pPr>
+              <w:pStyle w:val="TableText"/>
+            </w:pPr>
+            <w:r>
+              <w:rPr>
+                <w:rFonts w:ascii="Arial" w:hAnsi="Arial"/>
+                <w:sz w:val="16"/>
+              </w:rPr>
+              <w:t>SPS 530 paras 10–15</w:t>
+            </w:r>
+          </w:p>
+        </w:tc>
+        <w:tc>
+          <w:tcPr>
+            <w:tcW w:type="dxa" w:w="7483"/>
+            <w:shd w:val="clear" w:color="auto" w:fill="F4F6FA"/>
+          </w:tcPr>
+          <w:p>
+            <w:pPr>
+              <w:pStyle w:val="TableText"/>
+            </w:pPr>
+            <w:r>
+              <w:rPr>
+                <w:rFonts w:ascii="Arial" w:hAnsi="Arial"/>
+                <w:sz w:val="16"/>
+              </w:rPr>
+              <w:t>Investment governance framework</w:t>
+            </w:r>
+          </w:p>
+        </w:tc>
+      </w:tr>
+      <w:tr>
+        <w:tc>
+          <w:tcPr>
+            <w:tcW w:type="dxa" w:w="1928"/>
+          </w:tcPr>
+          <w:p>
+            <w:pPr>
+              <w:pStyle w:val="TableText"/>
+            </w:pPr>
+            <w:r>
+              <w:rPr>
+                <w:rFonts w:ascii="Arial" w:hAnsi="Arial"/>
+                <w:sz w:val="16"/>
+              </w:rPr>
+              <w:t>SPS 530 paras 30–35</w:t>
+            </w:r>
+          </w:p>
+        </w:tc>
+        <w:tc>
+          <w:tcPr>
+            <w:tcW w:type="dxa" w:w="7483"/>
+          </w:tcPr>
+          <w:p>
+            <w:pPr>
+              <w:pStyle w:val="TableText"/>
+            </w:pPr>
+            <w:r>
+              <w:rPr>
+                <w:rFonts w:ascii="Arial" w:hAnsi="Arial"/>
+                <w:sz w:val="16"/>
+              </w:rPr>
+              <w:t>Investment stress testing</w:t>
             </w:r>
           </w:p>
         </w:tc>
@@ -20224,7 +20742,7 @@
                 <w:rFonts w:ascii="Arial" w:hAnsi="Arial"/>
                 <w:sz w:val="14"/>
               </w:rPr>
-              <w:t>Binding cross-industry prudential standard.</w:t>
+              <w:t>Binding cross-industry prudential standard. The current determination revokes and replaces the 2023 determination, under which CPS 230 commenced on 1 July 2025.</w:t>
             </w:r>
           </w:p>
         </w:tc>

</xml_diff>